<commit_message>
upload RE final versions
</commit_message>
<xml_diff>
--- a/CT60A5103 Software Engineering Models and Modeling/Topic 5/submission/submission Topic 5 Assignment.docx
+++ b/CT60A5103 Software Engineering Models and Modeling/Topic 5/submission/submission Topic 5 Assignment.docx
@@ -1,13 +1,13 @@
 
 <file path=word/document.xml><?xml version="1.0" encoding="utf-8"?>
-<w:document xmlns:wpc="http://schemas.microsoft.com/office/word/2010/wordprocessingCanvas" xmlns:cx="http://schemas.microsoft.com/office/drawing/2014/chartex" xmlns:cx1="http://schemas.microsoft.com/office/drawing/2015/9/8/chartex" xmlns:cx2="http://schemas.microsoft.com/office/drawing/2015/10/21/chartex" xmlns:cx3="http://schemas.microsoft.com/office/drawing/2016/5/9/chartex" xmlns:cx4="http://schemas.microsoft.com/office/drawing/2016/5/10/chartex" xmlns:cx5="http://schemas.microsoft.com/office/drawing/2016/5/11/chartex" xmlns:cx6="http://schemas.microsoft.com/office/drawing/2016/5/12/chartex" xmlns:cx7="http://schemas.microsoft.com/office/drawing/2016/5/13/chartex" xmlns:cx8="http://schemas.microsoft.com/office/drawing/2016/5/14/chartex" xmlns:mc="http://schemas.openxmlformats.org/markup-compatibility/2006" xmlns:aink="http://schemas.microsoft.com/office/drawing/2016/ink" xmlns:am3d="http://schemas.microsoft.com/office/drawing/2017/model3d" xmlns:o="urn:schemas-microsoft-com:office:office" xmlns:oel="http://schemas.microsoft.com/office/2019/extlst" xmlns:r="http://schemas.openxmlformats.org/officeDocument/2006/relationships" xmlns:m="http://schemas.openxmlformats.org/officeDocument/2006/math" xmlns:v="urn:schemas-microsoft-com:vml" xmlns:wp14="http://schemas.microsoft.com/office/word/2010/wordprocessingDrawing" xmlns:wp="http://schemas.openxmlformats.org/drawingml/2006/wordprocessingDrawing" xmlns:w10="urn:schemas-microsoft-com:office:word" xmlns:w="http://schemas.openxmlformats.org/wordprocessingml/2006/main" xmlns:w14="http://schemas.microsoft.com/office/word/2010/wordml" xmlns:w15="http://schemas.microsoft.com/office/word/2012/wordml" xmlns:w16cex="http://schemas.microsoft.com/office/word/2018/wordml/cex" xmlns:w16cid="http://schemas.microsoft.com/office/word/2016/wordml/cid" xmlns:w16="http://schemas.microsoft.com/office/word/2018/wordml" xmlns:w16du="http://schemas.microsoft.com/office/word/2023/wordml/word16du" xmlns:w16sdtdh="http://schemas.microsoft.com/office/word/2020/wordml/sdtdatahash" xmlns:w16sdtfl="http://schemas.microsoft.com/office/word/2024/wordml/sdtformatlock" xmlns:w16se="http://schemas.microsoft.com/office/word/2015/wordml/symex" xmlns:wpg="http://schemas.microsoft.com/office/word/2010/wordprocessingGroup" xmlns:wpi="http://schemas.microsoft.com/office/word/2010/wordprocessingInk" xmlns:wne="http://schemas.microsoft.com/office/word/2006/wordml" xmlns:wps="http://schemas.microsoft.com/office/word/2010/wordprocessingShape" mc:Ignorable="w14 w15 w16se w16cid w16 w16cex w16sdtdh w16sdtfl w16du wp14">
+<w:document xmlns:wpc="http://schemas.microsoft.com/office/word/2010/wordprocessingCanvas" xmlns:cx="http://schemas.microsoft.com/office/drawing/2014/chartex" xmlns:cx1="http://schemas.microsoft.com/office/drawing/2015/9/8/chartex" xmlns:cx2="http://schemas.microsoft.com/office/drawing/2015/10/21/chartex" xmlns:cx3="http://schemas.microsoft.com/office/drawing/2016/5/9/chartex" xmlns:cx4="http://schemas.microsoft.com/office/drawing/2016/5/10/chartex" xmlns:cx5="http://schemas.microsoft.com/office/drawing/2016/5/11/chartex" xmlns:cx6="http://schemas.microsoft.com/office/drawing/2016/5/12/chartex" xmlns:cx7="http://schemas.microsoft.com/office/drawing/2016/5/13/chartex" xmlns:cx8="http://schemas.microsoft.com/office/drawing/2016/5/14/chartex" xmlns:mc="http://schemas.openxmlformats.org/markup-compatibility/2006" xmlns:aink="http://schemas.microsoft.com/office/drawing/2016/ink" xmlns:am3d="http://schemas.microsoft.com/office/drawing/2017/model3d" xmlns:o="urn:schemas-microsoft-com:office:office" xmlns:oel="http://schemas.microsoft.com/office/2019/extlst" xmlns:r="http://schemas.openxmlformats.org/officeDocument/2006/relationships" xmlns:m="http://schemas.openxmlformats.org/officeDocument/2006/math" xmlns:v="urn:schemas-microsoft-com:vml" xmlns:wp14="http://schemas.microsoft.com/office/word/2010/wordprocessingDrawing" xmlns:wp="http://schemas.openxmlformats.org/drawingml/2006/wordprocessingDrawing" xmlns:w10="urn:schemas-microsoft-com:office:word" xmlns:w="http://schemas.openxmlformats.org/wordprocessingml/2006/main" xmlns:w14="http://schemas.microsoft.com/office/word/2010/wordml" xmlns:w15="http://schemas.microsoft.com/office/word/2012/wordml" xmlns:w16cex="http://schemas.microsoft.com/office/word/2018/wordml/cex" xmlns:w16cid="http://schemas.microsoft.com/office/word/2016/wordml/cid" xmlns:w16="http://schemas.microsoft.com/office/word/2018/wordml" xmlns:w16du="http://schemas.microsoft.com/office/word/2023/wordml/word16du" xmlns:w16sdtdh="http://schemas.microsoft.com/office/word/2020/wordml/sdtdatahash" xmlns:w16sdtfl="http://schemas.microsoft.com/office/word/2024/wordml/sdtformatlock" xmlns:w16se="http://schemas.microsoft.com/office/word/2015/wordml/symex" xmlns:wpg="http://schemas.microsoft.com/office/word/2010/wordprocessingGroup" xmlns:wpi="http://schemas.microsoft.com/office/word/2010/wordprocessingInk" xmlns:wne="http://schemas.microsoft.com/office/word/2006/wordml" xmlns:wps="http://schemas.microsoft.com/office/word/2010/wordprocessingShape" xmlns:a="http://schemas.openxmlformats.org/drawingml/2006/main" xmlns:pic="http://schemas.openxmlformats.org/drawingml/2006/picture" xmlns:a14="http://schemas.microsoft.com/office/drawing/2010/main" mc:Ignorable="w14 w15 w16se w16cid w16 w16cex w16sdtdh w16sdtfl w16du wp14">
   <w:body>
     <w:p>
       <w:pPr>
         <w:spacing w:before="100" w:beforeAutospacing="1" w:after="100" w:afterAutospacing="1" w:line="240" w:lineRule="auto"/>
         <w:outlineLvl w:val="0"/>
         <w:rPr>
-          <w:rFonts w:ascii="Times New Roman" w:eastAsia="Times New Roman" w:hAnsi="Times New Roman" w:cs="Times New Roman"/>
+          <w:rFonts w:ascii="Times New Roman" w:hAnsi="Times New Roman" w:eastAsia="Times New Roman" w:cs="Times New Roman"/>
           <w:b/>
           <w:bCs/>
           <w:kern w:val="36"/>
@@ -23,7 +23,7 @@
         <w:spacing w:before="100" w:beforeAutospacing="1" w:after="100" w:afterAutospacing="1" w:line="240" w:lineRule="auto"/>
         <w:outlineLvl w:val="0"/>
         <w:rPr>
-          <w:rFonts w:ascii="Times New Roman" w:eastAsia="Times New Roman" w:hAnsi="Times New Roman" w:cs="Times New Roman"/>
+          <w:rFonts w:ascii="Times New Roman" w:hAnsi="Times New Roman" w:eastAsia="Times New Roman" w:cs="Times New Roman"/>
           <w:b/>
           <w:bCs/>
           <w:kern w:val="36"/>
@@ -39,7 +39,7 @@
         <w:spacing w:before="100" w:beforeAutospacing="1" w:after="100" w:afterAutospacing="1" w:line="240" w:lineRule="auto"/>
         <w:outlineLvl w:val="0"/>
         <w:rPr>
-          <w:rFonts w:ascii="Times New Roman" w:eastAsia="Times New Roman" w:hAnsi="Times New Roman" w:cs="Times New Roman"/>
+          <w:rFonts w:ascii="Times New Roman" w:hAnsi="Times New Roman" w:eastAsia="Times New Roman" w:cs="Times New Roman"/>
           <w:b/>
           <w:bCs/>
           <w:kern w:val="36"/>
@@ -55,7 +55,7 @@
         <w:spacing w:before="100" w:beforeAutospacing="1" w:after="100" w:afterAutospacing="1" w:line="240" w:lineRule="auto"/>
         <w:outlineLvl w:val="0"/>
         <w:rPr>
-          <w:rFonts w:ascii="Times New Roman" w:eastAsia="Times New Roman" w:hAnsi="Times New Roman" w:cs="Times New Roman"/>
+          <w:rFonts w:ascii="Times New Roman" w:hAnsi="Times New Roman" w:eastAsia="Times New Roman" w:cs="Times New Roman"/>
           <w:b/>
           <w:bCs/>
           <w:kern w:val="36"/>
@@ -71,7 +71,7 @@
         <w:spacing w:before="100" w:beforeAutospacing="1" w:after="100" w:afterAutospacing="1" w:line="240" w:lineRule="auto"/>
         <w:outlineLvl w:val="0"/>
         <w:rPr>
-          <w:rFonts w:ascii="Times New Roman" w:eastAsia="Times New Roman" w:hAnsi="Times New Roman" w:cs="Times New Roman"/>
+          <w:rFonts w:ascii="Times New Roman" w:hAnsi="Times New Roman" w:eastAsia="Times New Roman" w:cs="Times New Roman"/>
           <w:b/>
           <w:bCs/>
           <w:kern w:val="36"/>
@@ -86,7 +86,7 @@
       <w:pPr>
         <w:spacing w:before="100" w:beforeAutospacing="1" w:after="100" w:afterAutospacing="1" w:line="240" w:lineRule="auto"/>
         <w:rPr>
-          <w:rFonts w:ascii="Times New Roman" w:eastAsia="Times New Roman" w:hAnsi="Times New Roman" w:cs="Times New Roman"/>
+          <w:rFonts w:ascii="Times New Roman" w:hAnsi="Times New Roman" w:eastAsia="Times New Roman" w:cs="Times New Roman"/>
           <w:b/>
           <w:bCs/>
           <w:kern w:val="36"/>
@@ -98,7 +98,7 @@
       </w:pPr>
       <w:r>
         <w:rPr>
-          <w:rFonts w:ascii="Times New Roman" w:eastAsia="Times New Roman" w:hAnsi="Times New Roman" w:cs="Times New Roman"/>
+          <w:rFonts w:ascii="Times New Roman" w:hAnsi="Times New Roman" w:eastAsia="Times New Roman" w:cs="Times New Roman"/>
           <w:b/>
           <w:bCs/>
           <w:kern w:val="36"/>
@@ -111,7 +111,7 @@
       </w:r>
       <w:r>
         <w:rPr>
-          <w:rFonts w:ascii="Times New Roman" w:hAnsi="Times New Roman" w:cs="Times New Roman" w:hint="eastAsia"/>
+          <w:rFonts w:hint="eastAsia" w:ascii="Times New Roman" w:hAnsi="Times New Roman" w:cs="Times New Roman"/>
           <w:b/>
           <w:bCs/>
           <w:kern w:val="36"/>
@@ -124,7 +124,7 @@
       </w:r>
       <w:r>
         <w:rPr>
-          <w:rFonts w:ascii="Times New Roman" w:eastAsia="Times New Roman" w:hAnsi="Times New Roman" w:cs="Times New Roman"/>
+          <w:rFonts w:ascii="Times New Roman" w:hAnsi="Times New Roman" w:eastAsia="Times New Roman" w:cs="Times New Roman"/>
           <w:b/>
           <w:bCs/>
           <w:kern w:val="36"/>
@@ -140,7 +140,7 @@
       <w:pPr>
         <w:spacing w:beforeAutospacing="1" w:afterAutospacing="1" w:line="240" w:lineRule="auto"/>
         <w:rPr>
-          <w:rFonts w:ascii="Times New Roman" w:eastAsia="Times New Roman" w:hAnsi="Times New Roman" w:cs="Times New Roman"/>
+          <w:rFonts w:ascii="Times New Roman" w:hAnsi="Times New Roman" w:eastAsia="Times New Roman" w:cs="Times New Roman"/>
           <w:b/>
           <w:bCs/>
           <w:sz w:val="36"/>
@@ -153,7 +153,7 @@
       <w:pPr>
         <w:spacing w:beforeAutospacing="1" w:afterAutospacing="1" w:line="240" w:lineRule="auto"/>
         <w:rPr>
-          <w:rFonts w:ascii="Times New Roman" w:eastAsia="Times New Roman" w:hAnsi="Times New Roman" w:cs="Times New Roman"/>
+          <w:rFonts w:ascii="Times New Roman" w:hAnsi="Times New Roman" w:eastAsia="Times New Roman" w:cs="Times New Roman"/>
           <w:b/>
           <w:bCs/>
           <w:sz w:val="36"/>
@@ -166,7 +166,7 @@
       <w:pPr>
         <w:spacing w:beforeAutospacing="1" w:afterAutospacing="1" w:line="240" w:lineRule="auto"/>
         <w:rPr>
-          <w:rFonts w:ascii="Times New Roman" w:eastAsia="Times New Roman" w:hAnsi="Times New Roman" w:cs="Times New Roman"/>
+          <w:rFonts w:ascii="Times New Roman" w:hAnsi="Times New Roman" w:eastAsia="Times New Roman" w:cs="Times New Roman"/>
           <w:b/>
           <w:bCs/>
           <w:sz w:val="36"/>
@@ -179,7 +179,7 @@
       <w:pPr>
         <w:spacing w:beforeAutospacing="1" w:afterAutospacing="1" w:line="240" w:lineRule="auto"/>
         <w:rPr>
-          <w:rFonts w:ascii="Times New Roman" w:eastAsia="Times New Roman" w:hAnsi="Times New Roman" w:cs="Times New Roman"/>
+          <w:rFonts w:ascii="Times New Roman" w:hAnsi="Times New Roman" w:eastAsia="Times New Roman" w:cs="Times New Roman"/>
           <w:b/>
           <w:bCs/>
           <w:sz w:val="36"/>
@@ -192,7 +192,7 @@
       <w:pPr>
         <w:spacing w:beforeAutospacing="1" w:afterAutospacing="1" w:line="240" w:lineRule="auto"/>
         <w:rPr>
-          <w:rFonts w:ascii="Times New Roman" w:eastAsia="Times New Roman" w:hAnsi="Times New Roman" w:cs="Times New Roman"/>
+          <w:rFonts w:ascii="Times New Roman" w:hAnsi="Times New Roman" w:eastAsia="Times New Roman" w:cs="Times New Roman"/>
           <w:b/>
           <w:bCs/>
           <w:sz w:val="36"/>
@@ -207,7 +207,7 @@
       </w:pPr>
       <w:r>
         <w:rPr>
-          <w:rFonts w:ascii="Times New Roman" w:eastAsia="Times New Roman" w:hAnsi="Times New Roman" w:cs="Times New Roman"/>
+          <w:rFonts w:ascii="Times New Roman" w:hAnsi="Times New Roman" w:eastAsia="Times New Roman" w:cs="Times New Roman"/>
           <w:b/>
           <w:bCs/>
           <w:kern w:val="0"/>
@@ -223,7 +223,7 @@
       <w:pPr>
         <w:spacing w:before="100" w:beforeAutospacing="1" w:after="100" w:afterAutospacing="1" w:line="240" w:lineRule="auto"/>
         <w:rPr>
-          <w:rFonts w:ascii="Times New Roman" w:eastAsia="Times New Roman" w:hAnsi="Times New Roman" w:cs="Times New Roman"/>
+          <w:rFonts w:ascii="Times New Roman" w:hAnsi="Times New Roman" w:eastAsia="Times New Roman" w:cs="Times New Roman"/>
           <w:sz w:val="28"/>
           <w:szCs w:val="28"/>
           <w:lang w:val="en-US" w:eastAsia="fi-FI"/>
@@ -253,7 +253,7 @@
       </w:pPr>
       <w:r>
         <w:rPr>
-          <w:rFonts w:ascii="Times New Roman" w:eastAsia="Times New Roman" w:hAnsi="Times New Roman" w:cs="Times New Roman"/>
+          <w:rFonts w:ascii="Times New Roman" w:hAnsi="Times New Roman" w:eastAsia="Times New Roman" w:cs="Times New Roman"/>
           <w:sz w:val="28"/>
           <w:szCs w:val="28"/>
           <w:lang w:val="en-US" w:eastAsia="fi-FI"/>
@@ -270,7 +270,7 @@
           <w:tab w:val="left" w:pos="3453"/>
         </w:tabs>
         <w:rPr>
-          <w:rFonts w:asciiTheme="majorHAnsi" w:eastAsiaTheme="majorEastAsia" w:hAnsiTheme="majorHAnsi" w:cstheme="majorBidi"/>
+          <w:rFonts w:asciiTheme="majorHAnsi" w:hAnsiTheme="majorHAnsi" w:eastAsiaTheme="majorEastAsia" w:cstheme="majorBidi"/>
           <w:color w:val="0F4761" w:themeColor="accent1" w:themeShade="BF"/>
           <w:sz w:val="40"/>
           <w:szCs w:val="40"/>
@@ -279,7 +279,7 @@
       </w:pPr>
       <w:r>
         <w:rPr>
-          <w:rFonts w:asciiTheme="majorHAnsi" w:eastAsiaTheme="majorEastAsia" w:hAnsiTheme="majorHAnsi" w:cstheme="majorBidi"/>
+          <w:rFonts w:asciiTheme="majorHAnsi" w:hAnsiTheme="majorHAnsi" w:eastAsiaTheme="majorEastAsia" w:cstheme="majorBidi"/>
           <w:color w:val="0F4761" w:themeColor="accent1" w:themeShade="BF"/>
           <w:sz w:val="40"/>
           <w:szCs w:val="40"/>
@@ -294,7 +294,7 @@
           <w:tab w:val="left" w:pos="3453"/>
         </w:tabs>
         <w:rPr>
-          <w:rFonts w:ascii="Times New Roman" w:eastAsia="Times New Roman" w:hAnsi="Times New Roman" w:cs="Times New Roman"/>
+          <w:rFonts w:ascii="Times New Roman" w:hAnsi="Times New Roman" w:eastAsia="Times New Roman" w:cs="Times New Roman"/>
           <w:b/>
           <w:bCs/>
           <w:kern w:val="0"/>
@@ -304,14 +304,14 @@
       </w:pPr>
       <w:r>
         <w:rPr>
-          <w:rFonts w:ascii="Times New Roman" w:eastAsia="Times New Roman" w:hAnsi="Times New Roman" w:cs="Times New Roman"/>
+          <w:rFonts w:ascii="Times New Roman" w:hAnsi="Times New Roman" w:eastAsia="Times New Roman" w:cs="Times New Roman"/>
           <w:lang w:val="en-US" w:eastAsia="fi-FI"/>
         </w:rPr>
         <w:br w:type="page"/>
       </w:r>
       <w:r>
         <w:rPr>
-          <w:rFonts w:ascii="Times New Roman" w:eastAsia="Times New Roman" w:hAnsi="Times New Roman" w:cs="Times New Roman"/>
+          <w:rFonts w:ascii="Times New Roman" w:hAnsi="Times New Roman" w:eastAsia="Times New Roman" w:cs="Times New Roman"/>
           <w:b/>
           <w:bCs/>
           <w:kern w:val="0"/>
@@ -337,64 +337,448 @@
       </w:r>
     </w:p>
     <w:p>
-      <w:pPr>
-        <w:rPr>
-          <w:lang w:val="en-US"/>
-        </w:rPr>
-      </w:pPr>
-      <w:r>
-        <w:rPr>
-          <w:lang w:val="en-US"/>
-        </w:rPr>
-        <w:t>In this assignment</w:t>
-      </w:r>
-      <w:r>
-        <w:rPr>
-          <w:lang w:val="en-US"/>
-        </w:rPr>
-        <w:t>, we used the book ‘Use Case Driven Object Modeling with UML: Theory and Practice</w:t>
-      </w:r>
-      <w:r>
-        <w:rPr>
-          <w:lang w:val="en-US"/>
-        </w:rPr>
-        <w:t>’</w:t>
-      </w:r>
-      <w:r>
-        <w:rPr>
-          <w:lang w:val="en-US"/>
-        </w:rPr>
-        <w:t xml:space="preserve"> to create a simplified domain model, a use case diagram, and a robustness analysis method to produce a boundary-entity-</w:t>
-      </w:r>
-      <w:r>
-        <w:rPr>
-          <w:lang w:val="en-US"/>
-        </w:rPr>
-        <w:t>controller diagram</w:t>
-      </w:r>
-      <w:r>
-        <w:rPr>
-          <w:lang w:val="en-US"/>
-        </w:rPr>
-        <w:t xml:space="preserve"> for AudioNow</w:t>
-      </w:r>
-      <w:r>
-        <w:rPr>
-          <w:lang w:val="en-US"/>
-        </w:rPr>
+      <w:pPr/>
+      <w:r>
+        <w:rPr>
+          <w:lang w:val="en-US"/>
+        </w:rPr>
+        <w:t xml:space="preserve">In this assignment, we converted the BCE diagram from Topic 4 into two UML diagrams: a collaboration diagram and a sequence diagram. Both diagrams are based on the "Buy Podcast Subscription" use case for </w:t>
+      </w:r>
+      <w:r>
+        <w:rPr>
+          <w:lang w:val="en-US"/>
+        </w:rPr>
+        <w:t>AudioNow</w:t>
+      </w:r>
+      <w:r>
+        <w:rPr>
+          <w:lang w:val="en-US"/>
+        </w:rPr>
+        <w:t>. We followed the Visual Paradigm tutorials.</w:t>
+      </w:r>
+    </w:p>
+    <w:p>
+      <w:pPr>
+        <w:spacing w:before="0" w:beforeAutospacing="off" w:after="160" w:afterAutospacing="off" w:line="276" w:lineRule="auto"/>
+        <w:rPr>
+          <w:rFonts w:ascii="Aptos" w:hAnsi="Aptos" w:eastAsia="Aptos" w:cs="Aptos"/>
+          <w:noProof w:val="0"/>
+          <w:sz w:val="24"/>
+          <w:szCs w:val="24"/>
+          <w:lang w:val="en-US"/>
+        </w:rPr>
+      </w:pPr>
+    </w:p>
+    <w:p>
+      <w:pPr>
+        <w:pStyle w:val="Normal"/>
+        <w:spacing w:before="0" w:beforeAutospacing="off" w:after="160" w:afterAutospacing="off" w:line="276" w:lineRule="auto"/>
+      </w:pPr>
+      <w:r>
+        <w:rPr>
+          <w:rFonts w:ascii="Aptos Display" w:hAnsi="Aptos Display" w:eastAsia="Aptos Display" w:cs="Aptos Display"/>
+          <w:noProof w:val="0"/>
+          <w:color w:val="0F4761" w:themeColor="accent1" w:themeTint="FF" w:themeShade="BF"/>
+          <w:sz w:val="32"/>
+          <w:szCs w:val="32"/>
+          <w:lang w:val="en-US"/>
+        </w:rPr>
+        <w:t>Collaboration diagram</w:t>
+      </w:r>
+    </w:p>
+    <w:p>
+      <w:pPr>
+        <w:pStyle w:val="Normal"/>
+        <w:spacing w:before="0" w:beforeAutospacing="off" w:after="160" w:afterAutospacing="off" w:line="276" w:lineRule="auto"/>
+      </w:pPr>
+      <w:r>
+        <w:drawing>
+          <wp:inline wp14:editId="1681CAA6" wp14:anchorId="2D3B77CD">
+            <wp:extent cx="6340475" cy="2510870"/>
+            <wp:effectExtent l="0" t="0" r="0" b="0"/>
+            <wp:docPr id="241028047" name="drawing"/>
+            <wp:cNvGraphicFramePr>
+              <a:graphicFrameLocks noChangeAspect="1"/>
+            </wp:cNvGraphicFramePr>
+            <a:graphic>
+              <a:graphicData xmlns:a="http://schemas.openxmlformats.org/drawingml/2006/main" uri="http://schemas.openxmlformats.org/drawingml/2006/picture">
+                <pic:pic xmlns:pic="http://schemas.openxmlformats.org/drawingml/2006/picture">
+                  <pic:nvPicPr>
+                    <pic:cNvPr id="241028047" name="Picture 241028047"/>
+                    <pic:cNvPicPr/>
+                  </pic:nvPicPr>
+                  <pic:blipFill>
+                    <a:blip xmlns:r="http://schemas.openxmlformats.org/officeDocument/2006/relationships" r:embed="rId1152101870">
+                      <a:extLst>
+                        <a:ext uri="{28A0092B-C50C-407E-A947-70E740481C1C}">
+                          <a14:useLocalDpi xmlns:a14="http://schemas.microsoft.com/office/drawing/2010/main"/>
+                        </a:ext>
+                      </a:extLst>
+                    </a:blip>
+                    <a:stretch>
+                      <a:fillRect/>
+                    </a:stretch>
+                  </pic:blipFill>
+                  <pic:spPr>
+                    <a:xfrm rot="0">
+                      <a:off x="0" y="0"/>
+                      <a:ext cx="6340475" cy="2510870"/>
+                    </a:xfrm>
+                    <a:prstGeom prst="rect">
+                      <a:avLst/>
+                    </a:prstGeom>
+                  </pic:spPr>
+                </pic:pic>
+              </a:graphicData>
+            </a:graphic>
+          </wp:inline>
+        </w:drawing>
+      </w:r>
+      <w:r>
+        <w:rPr/>
+        <w:t xml:space="preserve">We’ve </w:t>
+      </w:r>
+      <w:r>
+        <w:rPr/>
+        <w:t>kept</w:t>
+      </w:r>
+      <w:r>
+        <w:rPr/>
+        <w:t xml:space="preserve"> </w:t>
+      </w:r>
+      <w:r>
+        <w:rPr/>
+        <w:t>the</w:t>
+      </w:r>
+      <w:r>
+        <w:rPr/>
+        <w:t xml:space="preserve"> </w:t>
+      </w:r>
+      <w:r>
+        <w:rPr/>
+        <w:t>objects</w:t>
+      </w:r>
+      <w:r>
+        <w:rPr/>
+        <w:t xml:space="preserve"> and </w:t>
+      </w:r>
+      <w:r>
+        <w:rPr/>
+        <w:t>links</w:t>
+      </w:r>
+      <w:r>
+        <w:rPr/>
+        <w:t xml:space="preserve"> </w:t>
+      </w:r>
+      <w:r>
+        <w:rPr/>
+        <w:t>from</w:t>
+      </w:r>
+      <w:r>
+        <w:rPr/>
+        <w:t xml:space="preserve"> </w:t>
+      </w:r>
+      <w:r>
+        <w:rPr/>
+        <w:t>the</w:t>
+      </w:r>
+      <w:r>
+        <w:rPr/>
+        <w:t xml:space="preserve"> </w:t>
+      </w:r>
+      <w:r>
+        <w:rPr/>
+        <w:t>previous</w:t>
+      </w:r>
+      <w:r>
+        <w:rPr/>
+        <w:t xml:space="preserve"> BCE </w:t>
+      </w:r>
+      <w:r>
+        <w:rPr/>
+        <w:t>diagram</w:t>
+      </w:r>
+      <w:r>
+        <w:rPr/>
+        <w:t xml:space="preserve"> and </w:t>
+      </w:r>
+      <w:r>
+        <w:rPr/>
+        <w:t>added</w:t>
+      </w:r>
+      <w:r>
+        <w:rPr/>
+        <w:t xml:space="preserve"> </w:t>
+      </w:r>
+      <w:r>
+        <w:rPr/>
+        <w:t>numbered</w:t>
+      </w:r>
+      <w:r>
+        <w:rPr/>
+        <w:t xml:space="preserve"> </w:t>
+      </w:r>
+      <w:r>
+        <w:rPr/>
+        <w:t>messages</w:t>
+      </w:r>
+      <w:r>
+        <w:rPr/>
+        <w:t xml:space="preserve">. The </w:t>
+      </w:r>
+      <w:r>
+        <w:rPr/>
+        <w:t>numbers</w:t>
+      </w:r>
+      <w:r>
+        <w:rPr/>
+        <w:t xml:space="preserve"> </w:t>
+      </w:r>
+      <w:r>
+        <w:rPr/>
+        <w:t>are</w:t>
+      </w:r>
+      <w:r>
+        <w:rPr/>
+        <w:t xml:space="preserve"> </w:t>
+      </w:r>
+      <w:r>
+        <w:rPr/>
+        <w:t>shown</w:t>
+      </w:r>
+      <w:r>
+        <w:rPr/>
+        <w:t xml:space="preserve"> </w:t>
+      </w:r>
+      <w:r>
+        <w:rPr/>
+        <w:t>in</w:t>
+      </w:r>
+      <w:r>
+        <w:rPr/>
+        <w:t xml:space="preserve"> </w:t>
+      </w:r>
+      <w:r>
+        <w:rPr/>
+        <w:t>chronological</w:t>
+      </w:r>
+      <w:r>
+        <w:rPr/>
+        <w:t xml:space="preserve"> </w:t>
+      </w:r>
+      <w:r>
+        <w:rPr/>
+        <w:t>order</w:t>
+      </w:r>
+      <w:r>
+        <w:rPr/>
         <w:t>.</w:t>
       </w:r>
     </w:p>
     <w:p>
       <w:pPr>
-        <w:rPr>
-          <w:lang w:val="en-US"/>
-        </w:rPr>
+        <w:pStyle w:val="Normal"/>
+        <w:spacing w:before="0" w:beforeAutospacing="off" w:after="160" w:afterAutospacing="off" w:line="276" w:lineRule="auto"/>
+      </w:pPr>
+      <w:r>
+        <w:rPr>
+          <w:lang w:val="en-US"/>
+        </w:rPr>
+        <w:t xml:space="preserve">First, the Listener opens the Podcast page, and Show Plans retrieves the plans from </w:t>
+      </w:r>
+      <w:r>
+        <w:rPr>
+          <w:lang w:val="en-US"/>
+        </w:rPr>
+        <w:t>Subscription</w:t>
+      </w:r>
+      <w:r>
+        <w:rPr>
+          <w:lang w:val="en-US"/>
+        </w:rPr>
+        <w:t xml:space="preserve"> Plan. Then, Show Plans opens the Checkout page, where the Listener enters the payment details. Next, </w:t>
+      </w:r>
+      <w:r>
+        <w:rPr>
+          <w:lang w:val="en-US"/>
+        </w:rPr>
+        <w:t>Process</w:t>
+      </w:r>
+      <w:r>
+        <w:rPr>
+          <w:lang w:val="en-US"/>
+        </w:rPr>
+        <w:t xml:space="preserve"> Payment sends the payment to the payment gateway. The payment provider approves the payment, after which the payment is </w:t>
+      </w:r>
+      <w:r>
+        <w:rPr>
+          <w:lang w:val="en-US"/>
+        </w:rPr>
+        <w:t>saved</w:t>
+      </w:r>
+      <w:r>
+        <w:rPr>
+          <w:lang w:val="en-US"/>
+        </w:rPr>
+        <w:t xml:space="preserve"> and the subscription is created. Finally, the confirmation page is shown to the Listener.</w:t>
+      </w:r>
+    </w:p>
+    <w:p>
+      <w:pPr>
+        <w:pStyle w:val="Normal"/>
+        <w:spacing w:before="0" w:beforeAutospacing="off" w:after="160" w:afterAutospacing="off" w:line="276" w:lineRule="auto"/>
+        <w:rPr>
+          <w:rFonts w:ascii="Aptos Display" w:hAnsi="Aptos Display" w:eastAsia="Aptos Display" w:cs="Aptos Display"/>
+          <w:noProof w:val="0"/>
+          <w:color w:val="0F4761" w:themeColor="accent1" w:themeTint="FF" w:themeShade="BF"/>
+          <w:sz w:val="32"/>
+          <w:szCs w:val="32"/>
+          <w:lang w:val="en-US"/>
+        </w:rPr>
+      </w:pPr>
+    </w:p>
+    <w:p>
+      <w:pPr>
+        <w:pStyle w:val="Normal"/>
+        <w:spacing w:before="0" w:beforeAutospacing="off" w:after="160" w:afterAutospacing="off" w:line="276" w:lineRule="auto"/>
+      </w:pPr>
+      <w:r>
+        <w:rPr>
+          <w:rFonts w:ascii="Aptos Display" w:hAnsi="Aptos Display" w:eastAsia="Aptos Display" w:cs="Aptos Display"/>
+          <w:noProof w:val="0"/>
+          <w:color w:val="0F4761" w:themeColor="accent1" w:themeTint="FF" w:themeShade="BF"/>
+          <w:sz w:val="32"/>
+          <w:szCs w:val="32"/>
+          <w:lang w:val="en-US"/>
+        </w:rPr>
+        <w:t>Sequence diagram</w:t>
+      </w:r>
+    </w:p>
+    <w:p>
+      <w:pPr>
+        <w:pStyle w:val="Normal"/>
+        <w:spacing w:before="0" w:beforeAutospacing="off" w:after="160" w:afterAutospacing="off" w:line="276" w:lineRule="auto"/>
+      </w:pPr>
+      <w:r>
+        <w:drawing>
+          <wp:inline wp14:editId="06CA07AA" wp14:anchorId="072B8DFD">
+            <wp:extent cx="6607175" cy="2847352"/>
+            <wp:effectExtent l="0" t="0" r="0" b="0"/>
+            <wp:docPr id="237295801" name="drawing"/>
+            <wp:cNvGraphicFramePr>
+              <a:graphicFrameLocks noChangeAspect="1"/>
+            </wp:cNvGraphicFramePr>
+            <a:graphic>
+              <a:graphicData xmlns:a="http://schemas.openxmlformats.org/drawingml/2006/main" uri="http://schemas.openxmlformats.org/drawingml/2006/picture">
+                <pic:pic xmlns:pic="http://schemas.openxmlformats.org/drawingml/2006/picture">
+                  <pic:nvPicPr>
+                    <pic:cNvPr id="237295801" name="Picture 237295801"/>
+                    <pic:cNvPicPr/>
+                  </pic:nvPicPr>
+                  <pic:blipFill>
+                    <a:blip xmlns:r="http://schemas.openxmlformats.org/officeDocument/2006/relationships" r:embed="rId1018200561">
+                      <a:extLst>
+                        <a:ext uri="{28A0092B-C50C-407E-A947-70E740481C1C}">
+                          <a14:useLocalDpi xmlns:a14="http://schemas.microsoft.com/office/drawing/2010/main"/>
+                        </a:ext>
+                      </a:extLst>
+                    </a:blip>
+                    <a:stretch>
+                      <a:fillRect/>
+                    </a:stretch>
+                  </pic:blipFill>
+                  <pic:spPr>
+                    <a:xfrm rot="0">
+                      <a:off x="0" y="0"/>
+                      <a:ext cx="6607175" cy="2847352"/>
+                    </a:xfrm>
+                    <a:prstGeom prst="rect">
+                      <a:avLst/>
+                    </a:prstGeom>
+                  </pic:spPr>
+                </pic:pic>
+              </a:graphicData>
+            </a:graphic>
+          </wp:inline>
+        </w:drawing>
+      </w:r>
+      <w:r>
+        <w:rPr>
+          <w:lang w:val="en-US"/>
+        </w:rPr>
+        <w:t xml:space="preserve">In this section, </w:t>
+      </w:r>
+      <w:r>
+        <w:rPr>
+          <w:lang w:val="en-US"/>
+        </w:rPr>
+        <w:t>we have selected the payment scenario.</w:t>
+      </w:r>
+      <w:r>
+        <w:rPr>
+          <w:lang w:val="en-US"/>
+        </w:rPr>
+        <w:t xml:space="preserve"> We chose this scenario because it is the most important step.</w:t>
+      </w:r>
+      <w:r>
+        <w:rPr>
+          <w:lang w:val="en-US"/>
+        </w:rPr>
+        <w:t xml:space="preserve"> First, the listener enters payment details on the checkout page, then process payment sends the </w:t>
+      </w:r>
+      <w:r>
+        <w:rPr>
+          <w:lang w:val="en-US"/>
+        </w:rPr>
+        <w:t>payment to payment</w:t>
+      </w:r>
+      <w:r>
+        <w:rPr>
+          <w:lang w:val="en-US"/>
+        </w:rPr>
+        <w:t xml:space="preserve"> </w:t>
+      </w:r>
+      <w:r>
+        <w:rPr>
+          <w:lang w:val="en-US"/>
+        </w:rPr>
+        <w:t>gateaway</w:t>
+      </w:r>
+      <w:r>
+        <w:rPr>
+          <w:lang w:val="en-US"/>
+        </w:rPr>
+        <w:t>, the payment provider approves i</w:t>
+      </w:r>
+      <w:r>
+        <w:rPr>
+          <w:lang w:val="en-US"/>
+        </w:rPr>
+        <w:t xml:space="preserve">t, and the payment is saved. Once payment is done, the subscription will be created and saved. </w:t>
+      </w:r>
+      <w:r>
+        <w:rPr>
+          <w:lang w:val="en-US"/>
+        </w:rPr>
+        <w:t>Finally</w:t>
+      </w:r>
+      <w:r>
+        <w:rPr>
+          <w:lang w:val="en-US"/>
+        </w:rPr>
+        <w:t xml:space="preserve"> confirmation is shown.</w:t>
+      </w:r>
+    </w:p>
+    <w:p>
+      <w:pPr>
+        <w:pStyle w:val="Normal"/>
+        <w:spacing w:before="0" w:beforeAutospacing="off" w:after="160" w:afterAutospacing="off" w:line="276" w:lineRule="auto"/>
       </w:pPr>
     </w:p>
     <w:p>
       <w:pPr>
         <w:pStyle w:val="Heading2"/>
+        <w:spacing w:before="0" w:beforeAutospacing="off" w:after="160" w:afterAutospacing="off" w:line="276" w:lineRule="auto"/>
         <w:rPr>
           <w:sz w:val="40"/>
           <w:szCs w:val="40"/>
@@ -405,67 +789,64 @@
         <w:rPr>
           <w:lang w:val="en-US"/>
         </w:rPr>
-        <w:t xml:space="preserve">Simplified </w:t>
-      </w:r>
-      <w:r>
-        <w:rPr>
-          <w:lang w:val="en-US"/>
-        </w:rPr>
-        <w:t>D</w:t>
-      </w:r>
-      <w:r>
-        <w:rPr>
-          <w:lang w:val="en-US"/>
-        </w:rPr>
-        <w:t xml:space="preserve">omain </w:t>
-      </w:r>
-      <w:r>
-        <w:rPr>
-          <w:lang w:val="en-US"/>
-        </w:rPr>
-        <w:t>M</w:t>
-      </w:r>
-      <w:r>
-        <w:rPr>
-          <w:lang w:val="en-US"/>
-        </w:rPr>
-        <w:t>odel</w:t>
-      </w:r>
+        <w:t>AI Declarations</w:t>
+      </w:r>
+    </w:p>
+    <w:p>
+      <w:pPr/>
+      <w:r>
+        <w:rPr>
+          <w:lang w:val="en-US"/>
+        </w:rPr>
+        <w:t>No</w:t>
+      </w:r>
+      <w:r>
+        <w:rPr>
+          <w:lang w:val="en-US"/>
+        </w:rPr>
+        <w:t xml:space="preserve"> AI </w:t>
+      </w:r>
+      <w:r>
+        <w:rPr>
+          <w:lang w:val="en-US"/>
+        </w:rPr>
+        <w:t>was</w:t>
+      </w:r>
+      <w:r>
+        <w:rPr>
+          <w:lang w:val="en-US"/>
+        </w:rPr>
+        <w:t xml:space="preserve"> </w:t>
+      </w:r>
+      <w:r>
+        <w:rPr>
+          <w:lang w:val="en-US"/>
+        </w:rPr>
+        <w:t>used</w:t>
+      </w:r>
+      <w:r>
+        <w:rPr>
+          <w:lang w:val="en-US"/>
+        </w:rPr>
+        <w:t xml:space="preserve"> in this assignment</w:t>
+      </w:r>
+      <w:r>
+        <w:rPr>
+          <w:lang w:val="en-US"/>
+        </w:rPr>
+        <w:t>.</w:t>
+      </w:r>
+    </w:p>
+    <w:p>
+      <w:pPr>
+        <w:rPr>
+          <w:lang w:val="en-US"/>
+        </w:rPr>
+      </w:pPr>
     </w:p>
     <w:p>
       <w:pPr>
         <w:pStyle w:val="Heading2"/>
-        <w:rPr>
-          <w:lang w:val="en-US"/>
-        </w:rPr>
-      </w:pPr>
-    </w:p>
-    <w:p>
-      <w:pPr>
-        <w:pStyle w:val="Heading2"/>
-        <w:rPr>
-          <w:sz w:val="40"/>
-          <w:szCs w:val="40"/>
-          <w:lang w:val="en-US"/>
-        </w:rPr>
-      </w:pPr>
-      <w:r>
-        <w:rPr>
-          <w:lang w:val="en-US"/>
-        </w:rPr>
-        <w:t>AI Declarations</w:t>
-      </w:r>
-    </w:p>
-    <w:p>
-      <w:pPr>
-        <w:rPr>
-          <w:lang w:val="en-US"/>
-        </w:rPr>
-      </w:pPr>
-    </w:p>
-    <w:p>
-      <w:pPr>
-        <w:pStyle w:val="Heading2"/>
       </w:pPr>
       <w:r>
         <w:rPr>
@@ -475,14 +856,229 @@
       </w:r>
     </w:p>
     <w:p>
-      <w:pPr>
-        <w:rPr>
-          <w:lang w:val="en-US"/>
-        </w:rPr>
-      </w:pPr>
+      <w:r>
+        <w:rPr>
+          <w:lang w:val="en-US"/>
+        </w:rPr>
+        <w:t>Visual</w:t>
+      </w:r>
+      <w:r>
+        <w:rPr>
+          <w:lang w:val="en-US"/>
+        </w:rPr>
+        <w:t xml:space="preserve"> </w:t>
+      </w:r>
+      <w:r>
+        <w:rPr>
+          <w:lang w:val="en-US"/>
+        </w:rPr>
+        <w:t>Paradigm</w:t>
+      </w:r>
+      <w:r>
+        <w:rPr>
+          <w:lang w:val="en-US"/>
+        </w:rPr>
+        <w:t>.</w:t>
+      </w:r>
+      <w:r>
+        <w:rPr>
+          <w:lang w:val="en-US"/>
+        </w:rPr>
+        <w:t xml:space="preserve"> </w:t>
+      </w:r>
+      <w:r>
+        <w:rPr>
+          <w:lang w:val="en-US"/>
+        </w:rPr>
+        <w:t>What</w:t>
+      </w:r>
+      <w:r>
+        <w:rPr>
+          <w:lang w:val="en-US"/>
+        </w:rPr>
+        <w:t xml:space="preserve"> </w:t>
+      </w:r>
+      <w:r>
+        <w:rPr>
+          <w:lang w:val="en-US"/>
+        </w:rPr>
+        <w:t>is</w:t>
+      </w:r>
+      <w:r>
+        <w:rPr>
+          <w:lang w:val="en-US"/>
+        </w:rPr>
+        <w:t xml:space="preserve"> </w:t>
+      </w:r>
+      <w:r>
+        <w:rPr>
+          <w:lang w:val="en-US"/>
+        </w:rPr>
+        <w:t>UML</w:t>
+      </w:r>
+      <w:r>
+        <w:rPr>
+          <w:lang w:val="en-US"/>
+        </w:rPr>
+        <w:t xml:space="preserve"> </w:t>
+      </w:r>
+      <w:r>
+        <w:rPr>
+          <w:lang w:val="en-US"/>
+        </w:rPr>
+        <w:t>collaboration</w:t>
+      </w:r>
+      <w:r>
+        <w:rPr>
+          <w:lang w:val="en-US"/>
+        </w:rPr>
+        <w:t xml:space="preserve"> </w:t>
+      </w:r>
+      <w:r>
+        <w:rPr>
+          <w:lang w:val="en-US"/>
+        </w:rPr>
+        <w:t>diagram</w:t>
+      </w:r>
+      <w:r>
+        <w:rPr>
+          <w:lang w:val="en-US"/>
+        </w:rPr>
+        <w:t xml:space="preserve">? </w:t>
+      </w:r>
+      <w:hyperlink r:id="R73bc6810f7474a6a">
+        <w:r>
+          <w:rPr>
+            <w:rStyle w:val="Hyperlink"/>
+            <w:lang w:val="en-US"/>
+          </w:rPr>
+          <w:t>https://www.visual-paradigm.com/guide/uml-unified-modeling-language/what-is-uml-collaboration-diagram/</w:t>
+        </w:r>
+      </w:hyperlink>
+    </w:p>
+    <w:p>
+      <w:pPr>
+        <w:pStyle w:val="Normal"/>
+      </w:pPr>
+      <w:r>
+        <w:rPr>
+          <w:lang w:val="en-US"/>
+        </w:rPr>
+        <w:t xml:space="preserve"> </w:t>
+      </w:r>
+    </w:p>
+    <w:p>
+      <w:pPr>
+        <w:pStyle w:val="Normal"/>
+      </w:pPr>
+      <w:r>
+        <w:rPr>
+          <w:lang w:val="en-US"/>
+        </w:rPr>
+        <w:t>Visual</w:t>
+      </w:r>
+      <w:r>
+        <w:rPr>
+          <w:lang w:val="en-US"/>
+        </w:rPr>
+        <w:t xml:space="preserve"> </w:t>
+      </w:r>
+      <w:r>
+        <w:rPr>
+          <w:lang w:val="en-US"/>
+        </w:rPr>
+        <w:t>Paradigm</w:t>
+      </w:r>
+      <w:r>
+        <w:rPr>
+          <w:lang w:val="en-US"/>
+        </w:rPr>
+        <w:t xml:space="preserve">. </w:t>
+      </w:r>
+      <w:r>
+        <w:rPr>
+          <w:lang w:val="en-US"/>
+        </w:rPr>
+        <w:t>A</w:t>
+      </w:r>
+      <w:r>
+        <w:rPr>
+          <w:lang w:val="en-US"/>
+        </w:rPr>
+        <w:t xml:space="preserve"> </w:t>
+      </w:r>
+      <w:r>
+        <w:rPr>
+          <w:lang w:val="en-US"/>
+        </w:rPr>
+        <w:t>practical</w:t>
+      </w:r>
+      <w:r>
+        <w:rPr>
+          <w:lang w:val="en-US"/>
+        </w:rPr>
+        <w:t xml:space="preserve"> </w:t>
+      </w:r>
+      <w:r>
+        <w:rPr>
+          <w:lang w:val="en-US"/>
+        </w:rPr>
+        <w:t>tutorial</w:t>
+      </w:r>
+      <w:r>
+        <w:rPr>
+          <w:lang w:val="en-US"/>
+        </w:rPr>
+        <w:t xml:space="preserve"> </w:t>
+      </w:r>
+      <w:r>
+        <w:rPr>
+          <w:lang w:val="en-US"/>
+        </w:rPr>
+        <w:t>on</w:t>
+      </w:r>
+      <w:r>
+        <w:rPr>
+          <w:lang w:val="en-US"/>
+        </w:rPr>
+        <w:t xml:space="preserve"> </w:t>
+      </w:r>
+      <w:r>
+        <w:rPr>
+          <w:lang w:val="en-US"/>
+        </w:rPr>
+        <w:t>robustness</w:t>
+      </w:r>
+      <w:r>
+        <w:rPr>
+          <w:lang w:val="en-US"/>
+        </w:rPr>
+        <w:t xml:space="preserve"> </w:t>
+      </w:r>
+      <w:r>
+        <w:rPr>
+          <w:lang w:val="en-US"/>
+        </w:rPr>
+        <w:t>analysis</w:t>
+      </w:r>
+      <w:r>
+        <w:rPr>
+          <w:lang w:val="en-US"/>
+        </w:rPr>
+        <w:t xml:space="preserve">. </w:t>
+      </w:r>
+      <w:hyperlink r:id="R55e87d4906ba47d3">
+        <w:r>
+          <w:rPr>
+            <w:rStyle w:val="Hyperlink"/>
+            <w:lang w:val="en-US"/>
+          </w:rPr>
+          <w:t>https://www.visual-paradigm.com/guide/uml-unified-modeling-language/robustness-analysis-tutorial/</w:t>
+        </w:r>
+      </w:hyperlink>
     </w:p>
     <w:sectPr>
-      <w:pgSz w:w="11906" w:h="16838"/>
+      <w:pgSz w:w="11906" w:h="16838" w:orient="portrait"/>
       <w:pgMar w:top="1440" w:right="1440" w:bottom="1440" w:left="1440" w:header="708" w:footer="708" w:gutter="0"/>
       <w:cols w:space="708"/>
       <w:docGrid w:linePitch="360"/>
@@ -491,12 +1087,105 @@
 </w:document>
 </file>
 
+<file path=word/numbering.xml><?xml version="1.0" encoding="utf-8"?>
+<w:numbering xmlns:w="http://schemas.openxmlformats.org/wordprocessingml/2006/main">
+  <w:abstractNum xmlns:w="http://schemas.openxmlformats.org/wordprocessingml/2006/main" w:abstractNumId="1">
+    <w:nsid w:val="75f7052a"/>
+    <w:multiLevelType xmlns:w="http://schemas.openxmlformats.org/wordprocessingml/2006/main" w:val="hybridMultilevel"/>
+    <w:lvl xmlns:w="http://schemas.openxmlformats.org/wordprocessingml/2006/main" w:ilvl="0">
+      <w:start w:val="1"/>
+      <w:numFmt w:val="decimal"/>
+      <w:lvlText w:val="%1-"/>
+      <w:lvlJc w:val="left"/>
+      <w:pPr>
+        <w:ind w:left="720" w:hanging="360"/>
+      </w:pPr>
+    </w:lvl>
+    <w:lvl xmlns:w="http://schemas.openxmlformats.org/wordprocessingml/2006/main" w:ilvl="1">
+      <w:start w:val="1"/>
+      <w:numFmt w:val="lowerLetter"/>
+      <w:lvlText w:val="%2."/>
+      <w:lvlJc w:val="left"/>
+      <w:pPr>
+        <w:ind w:left="1440" w:hanging="360"/>
+      </w:pPr>
+    </w:lvl>
+    <w:lvl xmlns:w="http://schemas.openxmlformats.org/wordprocessingml/2006/main" w:ilvl="2">
+      <w:start w:val="1"/>
+      <w:numFmt w:val="lowerRoman"/>
+      <w:lvlText w:val="%3."/>
+      <w:lvlJc w:val="right"/>
+      <w:pPr>
+        <w:ind w:left="2160" w:hanging="180"/>
+      </w:pPr>
+    </w:lvl>
+    <w:lvl xmlns:w="http://schemas.openxmlformats.org/wordprocessingml/2006/main" w:ilvl="3">
+      <w:start w:val="1"/>
+      <w:numFmt w:val="decimal"/>
+      <w:lvlText w:val="%4."/>
+      <w:lvlJc w:val="left"/>
+      <w:pPr>
+        <w:ind w:left="2880" w:hanging="360"/>
+      </w:pPr>
+    </w:lvl>
+    <w:lvl xmlns:w="http://schemas.openxmlformats.org/wordprocessingml/2006/main" w:ilvl="4">
+      <w:start w:val="1"/>
+      <w:numFmt w:val="lowerLetter"/>
+      <w:lvlText w:val="%5."/>
+      <w:lvlJc w:val="left"/>
+      <w:pPr>
+        <w:ind w:left="3600" w:hanging="360"/>
+      </w:pPr>
+    </w:lvl>
+    <w:lvl xmlns:w="http://schemas.openxmlformats.org/wordprocessingml/2006/main" w:ilvl="5">
+      <w:start w:val="1"/>
+      <w:numFmt w:val="lowerRoman"/>
+      <w:lvlText w:val="%6."/>
+      <w:lvlJc w:val="right"/>
+      <w:pPr>
+        <w:ind w:left="4320" w:hanging="180"/>
+      </w:pPr>
+    </w:lvl>
+    <w:lvl xmlns:w="http://schemas.openxmlformats.org/wordprocessingml/2006/main" w:ilvl="6">
+      <w:start w:val="1"/>
+      <w:numFmt w:val="decimal"/>
+      <w:lvlText w:val="%7."/>
+      <w:lvlJc w:val="left"/>
+      <w:pPr>
+        <w:ind w:left="5040" w:hanging="360"/>
+      </w:pPr>
+    </w:lvl>
+    <w:lvl xmlns:w="http://schemas.openxmlformats.org/wordprocessingml/2006/main" w:ilvl="7">
+      <w:start w:val="1"/>
+      <w:numFmt w:val="lowerLetter"/>
+      <w:lvlText w:val="%8."/>
+      <w:lvlJc w:val="left"/>
+      <w:pPr>
+        <w:ind w:left="5760" w:hanging="360"/>
+      </w:pPr>
+    </w:lvl>
+    <w:lvl xmlns:w="http://schemas.openxmlformats.org/wordprocessingml/2006/main" w:ilvl="8">
+      <w:start w:val="1"/>
+      <w:numFmt w:val="lowerRoman"/>
+      <w:lvlText w:val="%9."/>
+      <w:lvlJc w:val="right"/>
+      <w:pPr>
+        <w:ind w:left="6480" w:hanging="180"/>
+      </w:pPr>
+    </w:lvl>
+  </w:abstractNum>
+  <w:num w:numId="1">
+    <w:abstractNumId w:val="1"/>
+  </w:num>
+</w:numbering>
+</file>
+
 <file path=word/styles.xml><?xml version="1.0" encoding="utf-8"?>
 <w:styles xmlns:mc="http://schemas.openxmlformats.org/markup-compatibility/2006" xmlns:r="http://schemas.openxmlformats.org/officeDocument/2006/relationships" xmlns:w="http://schemas.openxmlformats.org/wordprocessingml/2006/main" xmlns:w14="http://schemas.microsoft.com/office/word/2010/wordml" xmlns:w15="http://schemas.microsoft.com/office/word/2012/wordml" xmlns:w16cex="http://schemas.microsoft.com/office/word/2018/wordml/cex" xmlns:w16cid="http://schemas.microsoft.com/office/word/2016/wordml/cid" xmlns:w16="http://schemas.microsoft.com/office/word/2018/wordml" xmlns:w16du="http://schemas.microsoft.com/office/word/2023/wordml/word16du" xmlns:w16sdtdh="http://schemas.microsoft.com/office/word/2020/wordml/sdtdatahash" xmlns:w16sdtfl="http://schemas.microsoft.com/office/word/2024/wordml/sdtformatlock" xmlns:w16se="http://schemas.microsoft.com/office/word/2015/wordml/symex" mc:Ignorable="w14 w15 w16se w16cid w16 w16cex w16sdtdh w16sdtfl w16du">
   <w:docDefaults>
     <w:rPrDefault>
       <w:rPr>
-        <w:rFonts w:asciiTheme="minorHAnsi" w:eastAsiaTheme="minorEastAsia" w:hAnsiTheme="minorHAnsi" w:cstheme="minorBidi"/>
+        <w:rFonts w:asciiTheme="minorHAnsi" w:hAnsiTheme="minorHAnsi" w:eastAsiaTheme="minorEastAsia" w:cstheme="minorBidi"/>
         <w:kern w:val="2"/>
         <w:sz w:val="24"/>
         <w:szCs w:val="24"/>
@@ -513,14 +1202,14 @@
   <w:latentStyles w:defLockedState="0" w:defUIPriority="99" w:defSemiHidden="0" w:defUnhideWhenUsed="0" w:defQFormat="0" w:count="376">
     <w:lsdException w:name="Normal" w:uiPriority="0" w:qFormat="1"/>
     <w:lsdException w:name="heading 1" w:uiPriority="9" w:qFormat="1"/>
-    <w:lsdException w:name="heading 2" w:semiHidden="1" w:uiPriority="9" w:unhideWhenUsed="1" w:qFormat="1"/>
-    <w:lsdException w:name="heading 3" w:semiHidden="1" w:uiPriority="9" w:unhideWhenUsed="1" w:qFormat="1"/>
-    <w:lsdException w:name="heading 4" w:semiHidden="1" w:uiPriority="9" w:unhideWhenUsed="1" w:qFormat="1"/>
-    <w:lsdException w:name="heading 5" w:semiHidden="1" w:uiPriority="9" w:unhideWhenUsed="1" w:qFormat="1"/>
-    <w:lsdException w:name="heading 6" w:semiHidden="1" w:uiPriority="9" w:unhideWhenUsed="1" w:qFormat="1"/>
-    <w:lsdException w:name="heading 7" w:semiHidden="1" w:uiPriority="9" w:unhideWhenUsed="1" w:qFormat="1"/>
-    <w:lsdException w:name="heading 8" w:semiHidden="1" w:uiPriority="9" w:unhideWhenUsed="1" w:qFormat="1"/>
-    <w:lsdException w:name="heading 9" w:semiHidden="1" w:uiPriority="9" w:unhideWhenUsed="1" w:qFormat="1"/>
+    <w:lsdException w:name="heading 2" w:uiPriority="9" w:semiHidden="1" w:unhideWhenUsed="1" w:qFormat="1"/>
+    <w:lsdException w:name="heading 3" w:uiPriority="9" w:semiHidden="1" w:unhideWhenUsed="1" w:qFormat="1"/>
+    <w:lsdException w:name="heading 4" w:uiPriority="9" w:semiHidden="1" w:unhideWhenUsed="1" w:qFormat="1"/>
+    <w:lsdException w:name="heading 5" w:uiPriority="9" w:semiHidden="1" w:unhideWhenUsed="1" w:qFormat="1"/>
+    <w:lsdException w:name="heading 6" w:uiPriority="9" w:semiHidden="1" w:unhideWhenUsed="1" w:qFormat="1"/>
+    <w:lsdException w:name="heading 7" w:uiPriority="9" w:semiHidden="1" w:unhideWhenUsed="1" w:qFormat="1"/>
+    <w:lsdException w:name="heading 8" w:uiPriority="9" w:semiHidden="1" w:unhideWhenUsed="1" w:qFormat="1"/>
+    <w:lsdException w:name="heading 9" w:uiPriority="9" w:semiHidden="1" w:unhideWhenUsed="1" w:qFormat="1"/>
     <w:lsdException w:name="index 1" w:semiHidden="1" w:unhideWhenUsed="1"/>
     <w:lsdException w:name="index 2" w:semiHidden="1" w:unhideWhenUsed="1"/>
     <w:lsdException w:name="index 3" w:semiHidden="1" w:unhideWhenUsed="1"/>
@@ -530,22 +1219,22 @@
     <w:lsdException w:name="index 7" w:semiHidden="1" w:unhideWhenUsed="1"/>
     <w:lsdException w:name="index 8" w:semiHidden="1" w:unhideWhenUsed="1"/>
     <w:lsdException w:name="index 9" w:semiHidden="1" w:unhideWhenUsed="1"/>
-    <w:lsdException w:name="toc 1" w:semiHidden="1" w:uiPriority="39" w:unhideWhenUsed="1"/>
-    <w:lsdException w:name="toc 2" w:semiHidden="1" w:uiPriority="39" w:unhideWhenUsed="1"/>
-    <w:lsdException w:name="toc 3" w:semiHidden="1" w:uiPriority="39" w:unhideWhenUsed="1"/>
-    <w:lsdException w:name="toc 4" w:semiHidden="1" w:uiPriority="39" w:unhideWhenUsed="1"/>
-    <w:lsdException w:name="toc 5" w:semiHidden="1" w:uiPriority="39" w:unhideWhenUsed="1"/>
-    <w:lsdException w:name="toc 6" w:semiHidden="1" w:uiPriority="39" w:unhideWhenUsed="1"/>
-    <w:lsdException w:name="toc 7" w:semiHidden="1" w:uiPriority="39" w:unhideWhenUsed="1"/>
-    <w:lsdException w:name="toc 8" w:semiHidden="1" w:uiPriority="39" w:unhideWhenUsed="1"/>
-    <w:lsdException w:name="toc 9" w:semiHidden="1" w:uiPriority="39" w:unhideWhenUsed="1"/>
+    <w:lsdException w:name="toc 1" w:uiPriority="39" w:semiHidden="1" w:unhideWhenUsed="1"/>
+    <w:lsdException w:name="toc 2" w:uiPriority="39" w:semiHidden="1" w:unhideWhenUsed="1"/>
+    <w:lsdException w:name="toc 3" w:uiPriority="39" w:semiHidden="1" w:unhideWhenUsed="1"/>
+    <w:lsdException w:name="toc 4" w:uiPriority="39" w:semiHidden="1" w:unhideWhenUsed="1"/>
+    <w:lsdException w:name="toc 5" w:uiPriority="39" w:semiHidden="1" w:unhideWhenUsed="1"/>
+    <w:lsdException w:name="toc 6" w:uiPriority="39" w:semiHidden="1" w:unhideWhenUsed="1"/>
+    <w:lsdException w:name="toc 7" w:uiPriority="39" w:semiHidden="1" w:unhideWhenUsed="1"/>
+    <w:lsdException w:name="toc 8" w:uiPriority="39" w:semiHidden="1" w:unhideWhenUsed="1"/>
+    <w:lsdException w:name="toc 9" w:uiPriority="39" w:semiHidden="1" w:unhideWhenUsed="1"/>
     <w:lsdException w:name="Normal Indent" w:semiHidden="1" w:unhideWhenUsed="1"/>
     <w:lsdException w:name="footnote text" w:semiHidden="1" w:unhideWhenUsed="1"/>
     <w:lsdException w:name="annotation text" w:semiHidden="1" w:unhideWhenUsed="1"/>
     <w:lsdException w:name="header" w:semiHidden="1" w:unhideWhenUsed="1"/>
     <w:lsdException w:name="footer" w:semiHidden="1" w:unhideWhenUsed="1"/>
     <w:lsdException w:name="index heading" w:semiHidden="1" w:unhideWhenUsed="1"/>
-    <w:lsdException w:name="caption" w:semiHidden="1" w:uiPriority="35" w:unhideWhenUsed="1" w:qFormat="1"/>
+    <w:lsdException w:name="caption" w:uiPriority="35" w:semiHidden="1" w:unhideWhenUsed="1" w:qFormat="1"/>
     <w:lsdException w:name="table of figures" w:semiHidden="1" w:unhideWhenUsed="1"/>
     <w:lsdException w:name="envelope address" w:semiHidden="1" w:unhideWhenUsed="1"/>
     <w:lsdException w:name="envelope return" w:semiHidden="1" w:unhideWhenUsed="1"/>
@@ -576,7 +1265,7 @@
     <w:lsdException w:name="Title" w:uiPriority="10" w:qFormat="1"/>
     <w:lsdException w:name="Closing" w:semiHidden="1" w:unhideWhenUsed="1"/>
     <w:lsdException w:name="Signature" w:semiHidden="1" w:unhideWhenUsed="1"/>
-    <w:lsdException w:name="Default Paragraph Font" w:semiHidden="1" w:uiPriority="1" w:unhideWhenUsed="1"/>
+    <w:lsdException w:name="Default Paragraph Font" w:uiPriority="1" w:semiHidden="1" w:unhideWhenUsed="1"/>
     <w:lsdException w:name="Body Text" w:semiHidden="1" w:unhideWhenUsed="1"/>
     <w:lsdException w:name="Body Text Indent" w:semiHidden="1" w:unhideWhenUsed="1"/>
     <w:lsdException w:name="List Continue" w:semiHidden="1" w:unhideWhenUsed="1"/>
@@ -776,8 +1465,8 @@
     <w:lsdException w:name="Subtle Reference" w:uiPriority="31" w:qFormat="1"/>
     <w:lsdException w:name="Intense Reference" w:uiPriority="32" w:qFormat="1"/>
     <w:lsdException w:name="Book Title" w:uiPriority="33" w:qFormat="1"/>
-    <w:lsdException w:name="Bibliography" w:semiHidden="1" w:uiPriority="37" w:unhideWhenUsed="1"/>
-    <w:lsdException w:name="TOC Heading" w:semiHidden="1" w:uiPriority="39" w:unhideWhenUsed="1" w:qFormat="1"/>
+    <w:lsdException w:name="Bibliography" w:uiPriority="37" w:semiHidden="1" w:unhideWhenUsed="1"/>
+    <w:lsdException w:name="TOC Heading" w:uiPriority="39" w:semiHidden="1" w:unhideWhenUsed="1" w:qFormat="1"/>
     <w:lsdException w:name="Plain Table 1" w:uiPriority="41"/>
     <w:lsdException w:name="Plain Table 2" w:uiPriority="42"/>
     <w:lsdException w:name="Plain Table 3" w:uiPriority="43"/>
@@ -888,7 +1577,7 @@
     <w:lsdException w:name="Unresolved Mention" w:semiHidden="1" w:unhideWhenUsed="1"/>
     <w:lsdException w:name="Smart Link" w:semiHidden="1" w:unhideWhenUsed="1"/>
   </w:latentStyles>
-  <w:style w:type="paragraph" w:default="1" w:styleId="Normal">
+  <w:style w:type="paragraph" w:styleId="Normal" w:default="1">
     <w:name w:val="Normal"/>
     <w:qFormat/>
   </w:style>
@@ -907,7 +1596,7 @@
       <w:outlineLvl w:val="0"/>
     </w:pPr>
     <w:rPr>
-      <w:rFonts w:asciiTheme="majorHAnsi" w:eastAsiaTheme="majorEastAsia" w:hAnsiTheme="majorHAnsi" w:cstheme="majorBidi"/>
+      <w:rFonts w:asciiTheme="majorHAnsi" w:hAnsiTheme="majorHAnsi" w:eastAsiaTheme="majorEastAsia" w:cstheme="majorBidi"/>
       <w:color w:val="0F4761" w:themeColor="accent1" w:themeShade="BF"/>
       <w:sz w:val="40"/>
       <w:szCs w:val="40"/>
@@ -930,7 +1619,7 @@
       <w:outlineLvl w:val="1"/>
     </w:pPr>
     <w:rPr>
-      <w:rFonts w:asciiTheme="majorHAnsi" w:eastAsiaTheme="majorEastAsia" w:hAnsiTheme="majorHAnsi" w:cstheme="majorBidi"/>
+      <w:rFonts w:asciiTheme="majorHAnsi" w:hAnsiTheme="majorHAnsi" w:eastAsiaTheme="majorEastAsia" w:cstheme="majorBidi"/>
       <w:color w:val="0F4761" w:themeColor="accent1" w:themeShade="BF"/>
       <w:sz w:val="32"/>
       <w:szCs w:val="32"/>
@@ -1091,13 +1780,13 @@
       <w:color w:val="272727" w:themeColor="text1" w:themeTint="D8"/>
     </w:rPr>
   </w:style>
-  <w:style w:type="character" w:default="1" w:styleId="DefaultParagraphFont">
+  <w:style w:type="character" w:styleId="DefaultParagraphFont" w:default="1">
     <w:name w:val="Default Paragraph Font"/>
     <w:uiPriority w:val="1"/>
     <w:semiHidden/>
     <w:unhideWhenUsed/>
   </w:style>
-  <w:style w:type="table" w:default="1" w:styleId="TableNormal">
+  <w:style w:type="table" w:styleId="TableNormal" w:default="1">
     <w:name w:val="Normal Table"/>
     <w:uiPriority w:val="99"/>
     <w:semiHidden/>
@@ -1112,26 +1801,26 @@
       </w:tblCellMar>
     </w:tblPr>
   </w:style>
-  <w:style w:type="numbering" w:default="1" w:styleId="NoList">
+  <w:style w:type="numbering" w:styleId="NoList" w:default="1">
     <w:name w:val="No List"/>
     <w:uiPriority w:val="99"/>
     <w:semiHidden/>
     <w:unhideWhenUsed/>
   </w:style>
-  <w:style w:type="character" w:customStyle="1" w:styleId="Heading1Char">
+  <w:style w:type="character" w:styleId="Heading1Char" w:customStyle="1">
     <w:name w:val="Heading 1 Char"/>
     <w:basedOn w:val="DefaultParagraphFont"/>
     <w:link w:val="Heading1"/>
     <w:uiPriority w:val="9"/>
     <w:rsid w:val="00612C54"/>
     <w:rPr>
-      <w:rFonts w:asciiTheme="majorHAnsi" w:eastAsiaTheme="majorEastAsia" w:hAnsiTheme="majorHAnsi" w:cstheme="majorBidi"/>
+      <w:rFonts w:asciiTheme="majorHAnsi" w:hAnsiTheme="majorHAnsi" w:eastAsiaTheme="majorEastAsia" w:cstheme="majorBidi"/>
       <w:color w:val="0F4761" w:themeColor="accent1" w:themeShade="BF"/>
       <w:sz w:val="40"/>
       <w:szCs w:val="40"/>
     </w:rPr>
   </w:style>
-  <w:style w:type="character" w:customStyle="1" w:styleId="Heading2Char">
+  <w:style w:type="character" w:styleId="Heading2Char" w:customStyle="1">
     <w:name w:val="Heading 2 Char"/>
     <w:basedOn w:val="DefaultParagraphFont"/>
     <w:link w:val="Heading2"/>
@@ -1139,13 +1828,13 @@
     <w:semiHidden/>
     <w:rsid w:val="00612C54"/>
     <w:rPr>
-      <w:rFonts w:asciiTheme="majorHAnsi" w:eastAsiaTheme="majorEastAsia" w:hAnsiTheme="majorHAnsi" w:cstheme="majorBidi"/>
+      <w:rFonts w:asciiTheme="majorHAnsi" w:hAnsiTheme="majorHAnsi" w:eastAsiaTheme="majorEastAsia" w:cstheme="majorBidi"/>
       <w:color w:val="0F4761" w:themeColor="accent1" w:themeShade="BF"/>
       <w:sz w:val="32"/>
       <w:szCs w:val="32"/>
     </w:rPr>
   </w:style>
-  <w:style w:type="character" w:customStyle="1" w:styleId="Heading3Char">
+  <w:style w:type="character" w:styleId="Heading3Char" w:customStyle="1">
     <w:name w:val="Heading 3 Char"/>
     <w:basedOn w:val="DefaultParagraphFont"/>
     <w:link w:val="Heading3"/>
@@ -1159,7 +1848,7 @@
       <w:szCs w:val="28"/>
     </w:rPr>
   </w:style>
-  <w:style w:type="character" w:customStyle="1" w:styleId="Heading4Char">
+  <w:style w:type="character" w:styleId="Heading4Char" w:customStyle="1">
     <w:name w:val="Heading 4 Char"/>
     <w:basedOn w:val="DefaultParagraphFont"/>
     <w:link w:val="Heading4"/>
@@ -1173,7 +1862,7 @@
       <w:color w:val="0F4761" w:themeColor="accent1" w:themeShade="BF"/>
     </w:rPr>
   </w:style>
-  <w:style w:type="character" w:customStyle="1" w:styleId="Heading5Char">
+  <w:style w:type="character" w:styleId="Heading5Char" w:customStyle="1">
     <w:name w:val="Heading 5 Char"/>
     <w:basedOn w:val="DefaultParagraphFont"/>
     <w:link w:val="Heading5"/>
@@ -1185,7 +1874,7 @@
       <w:color w:val="0F4761" w:themeColor="accent1" w:themeShade="BF"/>
     </w:rPr>
   </w:style>
-  <w:style w:type="character" w:customStyle="1" w:styleId="Heading6Char">
+  <w:style w:type="character" w:styleId="Heading6Char" w:customStyle="1">
     <w:name w:val="Heading 6 Char"/>
     <w:basedOn w:val="DefaultParagraphFont"/>
     <w:link w:val="Heading6"/>
@@ -1199,7 +1888,7 @@
       <w:color w:val="595959" w:themeColor="text1" w:themeTint="A6"/>
     </w:rPr>
   </w:style>
-  <w:style w:type="character" w:customStyle="1" w:styleId="Heading7Char">
+  <w:style w:type="character" w:styleId="Heading7Char" w:customStyle="1">
     <w:name w:val="Heading 7 Char"/>
     <w:basedOn w:val="DefaultParagraphFont"/>
     <w:link w:val="Heading7"/>
@@ -1211,7 +1900,7 @@
       <w:color w:val="595959" w:themeColor="text1" w:themeTint="A6"/>
     </w:rPr>
   </w:style>
-  <w:style w:type="character" w:customStyle="1" w:styleId="Heading8Char">
+  <w:style w:type="character" w:styleId="Heading8Char" w:customStyle="1">
     <w:name w:val="Heading 8 Char"/>
     <w:basedOn w:val="DefaultParagraphFont"/>
     <w:link w:val="Heading8"/>
@@ -1225,7 +1914,7 @@
       <w:color w:val="272727" w:themeColor="text1" w:themeTint="D8"/>
     </w:rPr>
   </w:style>
-  <w:style w:type="character" w:customStyle="1" w:styleId="Heading9Char">
+  <w:style w:type="character" w:styleId="Heading9Char" w:customStyle="1">
     <w:name w:val="Heading 9 Char"/>
     <w:basedOn w:val="DefaultParagraphFont"/>
     <w:link w:val="Heading9"/>
@@ -1250,21 +1939,21 @@
       <w:contextualSpacing/>
     </w:pPr>
     <w:rPr>
-      <w:rFonts w:asciiTheme="majorHAnsi" w:eastAsiaTheme="majorEastAsia" w:hAnsiTheme="majorHAnsi" w:cstheme="majorBidi"/>
+      <w:rFonts w:asciiTheme="majorHAnsi" w:hAnsiTheme="majorHAnsi" w:eastAsiaTheme="majorEastAsia" w:cstheme="majorBidi"/>
       <w:spacing w:val="-10"/>
       <w:kern w:val="28"/>
       <w:sz w:val="56"/>
       <w:szCs w:val="56"/>
     </w:rPr>
   </w:style>
-  <w:style w:type="character" w:customStyle="1" w:styleId="TitleChar">
+  <w:style w:type="character" w:styleId="TitleChar" w:customStyle="1">
     <w:name w:val="Title Char"/>
     <w:basedOn w:val="DefaultParagraphFont"/>
     <w:link w:val="Title"/>
     <w:uiPriority w:val="10"/>
     <w:rsid w:val="00612C54"/>
     <w:rPr>
-      <w:rFonts w:asciiTheme="majorHAnsi" w:eastAsiaTheme="majorEastAsia" w:hAnsiTheme="majorHAnsi" w:cstheme="majorBidi"/>
+      <w:rFonts w:asciiTheme="majorHAnsi" w:hAnsiTheme="majorHAnsi" w:eastAsiaTheme="majorEastAsia" w:cstheme="majorBidi"/>
       <w:spacing w:val="-10"/>
       <w:kern w:val="28"/>
       <w:sz w:val="56"/>
@@ -1292,7 +1981,7 @@
       <w:szCs w:val="28"/>
     </w:rPr>
   </w:style>
-  <w:style w:type="character" w:customStyle="1" w:styleId="SubtitleChar">
+  <w:style w:type="character" w:styleId="SubtitleChar" w:customStyle="1">
     <w:name w:val="Subtitle Char"/>
     <w:basedOn w:val="DefaultParagraphFont"/>
     <w:link w:val="Subtitle"/>
@@ -1324,7 +2013,7 @@
       <w:color w:val="404040" w:themeColor="text1" w:themeTint="BF"/>
     </w:rPr>
   </w:style>
-  <w:style w:type="character" w:customStyle="1" w:styleId="QuoteChar">
+  <w:style w:type="character" w:styleId="QuoteChar" w:customStyle="1">
     <w:name w:val="Quote Char"/>
     <w:basedOn w:val="DefaultParagraphFont"/>
     <w:link w:val="Quote"/>
@@ -1369,8 +2058,8 @@
     <w:rsid w:val="00612C54"/>
     <w:pPr>
       <w:pBdr>
-        <w:top w:val="single" w:sz="4" w:space="10" w:color="0F4761" w:themeColor="accent1" w:themeShade="BF"/>
-        <w:bottom w:val="single" w:sz="4" w:space="10" w:color="0F4761" w:themeColor="accent1" w:themeShade="BF"/>
+        <w:top w:val="single" w:color="0F4761" w:themeColor="accent1" w:themeShade="BF" w:sz="4" w:space="10"/>
+        <w:bottom w:val="single" w:color="0F4761" w:themeColor="accent1" w:themeShade="BF" w:sz="4" w:space="10"/>
       </w:pBdr>
       <w:spacing w:before="360" w:after="360"/>
       <w:ind w:left="864" w:right="864"/>
@@ -1382,7 +2071,7 @@
       <w:color w:val="0F4761" w:themeColor="accent1" w:themeShade="BF"/>
     </w:rPr>
   </w:style>
-  <w:style w:type="character" w:customStyle="1" w:styleId="IntenseQuoteChar">
+  <w:style w:type="character" w:styleId="IntenseQuoteChar" w:customStyle="1">
     <w:name w:val="Intense Quote Char"/>
     <w:basedOn w:val="DefaultParagraphFont"/>
     <w:link w:val="IntenseQuote"/>
@@ -1423,7 +2112,7 @@
 </file>
 
 <file path=word/theme/theme1.xml><?xml version="1.0" encoding="utf-8"?>
-<a:theme xmlns:a="http://schemas.openxmlformats.org/drawingml/2006/main" name="Office Theme">
+<a:theme xmlns:a="http://schemas.openxmlformats.org/drawingml/2006/main" xmlns:thm15="http://schemas.microsoft.com/office/thememl/2012/main" name="Office Theme">
   <a:themeElements>
     <a:clrScheme name="Office">
       <a:dk1>

</xml_diff>